<commit_message>
Detailgetreue, pin-genaue Verkabelungspläne (A4988 & TMC2209) ergänzt
- docs/make_wiring_detailed.py: komplette 40-Pin-Pi-Leiste, voller Treiber-Pinout,
  Kondensatoren an korrekten Knoten, Spulenpaare, Sternmasse, Legende
- PNG+SVG in docs/images/, ins Konzept-Dokument eingebettet

Co-Authored-By: Claude Opus 4.8 <noreply@anthropic.com>
</commit_message>
<xml_diff>
--- a/docs/PiLiDAR_Technisches_Konzept.docx
+++ b/docs/PiLiDAR_Technisches_Konzept.docx
@@ -493,6 +493,15 @@
       </w:r>
     </w:p>
     <w:p>
+      <w:r>
+        <w:rPr>
+          <w:b w:val="0"/>
+          <w:i w:val="0"/>
+        </w:rPr>
+        <w:t>Übersichtspläne:</w:t>
+      </w:r>
+    </w:p>
+    <w:p>
       <w:pPr>
         <w:jc w:val="center"/>
       </w:pPr>
@@ -540,7 +549,7 @@
           <w:i/>
           <w:sz w:val="18"/>
         </w:rPr>
-        <w:t>Verkabelungsplan A4988 (Ist-Zustand)</w:t>
+        <w:t>Übersicht A4988 (Ist-Zustand)</w:t>
       </w:r>
     </w:p>
     <w:p>
@@ -591,7 +600,118 @@
           <w:i/>
           <w:sz w:val="18"/>
         </w:rPr>
-        <w:t>Verkabelungsplan TMC2209 (Upgrade)</w:t>
+        <w:t>Übersicht TMC2209 (Upgrade)</w:t>
+      </w:r>
+    </w:p>
+    <w:p>
+      <w:r>
+        <w:rPr>
+          <w:b w:val="0"/>
+          <w:i w:val="0"/>
+        </w:rPr>
+        <w:t>Detailgetreue, pin-genaue Pläne (komplette 40-Pin-Leiste, voller Treiber-Pinout, Kondensatoren an den korrekten Knoten, Spulenpaare, Sternmasse):</w:t>
+      </w:r>
+    </w:p>
+    <w:p>
+      <w:pPr>
+        <w:jc w:val="center"/>
+      </w:pPr>
+      <w:r>
+        <w:drawing>
+          <wp:inline xmlns:a="http://schemas.openxmlformats.org/drawingml/2006/main" xmlns:pic="http://schemas.openxmlformats.org/drawingml/2006/picture">
+            <wp:extent cx="5760720" cy="3734704"/>
+            <wp:docPr id="3" name="Picture 3"/>
+            <wp:cNvGraphicFramePr>
+              <a:graphicFrameLocks noChangeAspect="1"/>
+            </wp:cNvGraphicFramePr>
+            <a:graphic>
+              <a:graphicData uri="http://schemas.openxmlformats.org/drawingml/2006/picture">
+                <pic:pic>
+                  <pic:nvPicPr>
+                    <pic:cNvPr id="0" name="verkabelung_a4988_detail.png"/>
+                    <pic:cNvPicPr/>
+                  </pic:nvPicPr>
+                  <pic:blipFill>
+                    <a:blip r:embed="rId11"/>
+                    <a:stretch>
+                      <a:fillRect/>
+                    </a:stretch>
+                  </pic:blipFill>
+                  <pic:spPr>
+                    <a:xfrm>
+                      <a:off x="0" y="0"/>
+                      <a:ext cx="5760720" cy="3734704"/>
+                    </a:xfrm>
+                    <a:prstGeom prst="rect"/>
+                  </pic:spPr>
+                </pic:pic>
+              </a:graphicData>
+            </a:graphic>
+          </wp:inline>
+        </w:drawing>
+      </w:r>
+    </w:p>
+    <w:p>
+      <w:pPr>
+        <w:jc w:val="center"/>
+      </w:pPr>
+      <w:r>
+        <w:rPr>
+          <w:i/>
+          <w:sz w:val="18"/>
+        </w:rPr>
+        <w:t>Detailplan A4988 — pin-genau</w:t>
+      </w:r>
+    </w:p>
+    <w:p>
+      <w:pPr>
+        <w:jc w:val="center"/>
+      </w:pPr>
+      <w:r>
+        <w:drawing>
+          <wp:inline xmlns:a="http://schemas.openxmlformats.org/drawingml/2006/main" xmlns:pic="http://schemas.openxmlformats.org/drawingml/2006/picture">
+            <wp:extent cx="5760720" cy="3734704"/>
+            <wp:docPr id="4" name="Picture 4"/>
+            <wp:cNvGraphicFramePr>
+              <a:graphicFrameLocks noChangeAspect="1"/>
+            </wp:cNvGraphicFramePr>
+            <a:graphic>
+              <a:graphicData uri="http://schemas.openxmlformats.org/drawingml/2006/picture">
+                <pic:pic>
+                  <pic:nvPicPr>
+                    <pic:cNvPr id="0" name="verkabelung_tmc2209_detail.png"/>
+                    <pic:cNvPicPr/>
+                  </pic:nvPicPr>
+                  <pic:blipFill>
+                    <a:blip r:embed="rId12"/>
+                    <a:stretch>
+                      <a:fillRect/>
+                    </a:stretch>
+                  </pic:blipFill>
+                  <pic:spPr>
+                    <a:xfrm>
+                      <a:off x="0" y="0"/>
+                      <a:ext cx="5760720" cy="3734704"/>
+                    </a:xfrm>
+                    <a:prstGeom prst="rect"/>
+                  </pic:spPr>
+                </pic:pic>
+              </a:graphicData>
+            </a:graphic>
+          </wp:inline>
+        </w:drawing>
+      </w:r>
+    </w:p>
+    <w:p>
+      <w:pPr>
+        <w:jc w:val="center"/>
+      </w:pPr>
+      <w:r>
+        <w:rPr>
+          <w:i/>
+          <w:sz w:val="18"/>
+        </w:rPr>
+        <w:t>Detailplan TMC2209 — pin-genau (inkl. UART-Option)</w:t>
       </w:r>
     </w:p>
     <w:p>
@@ -602,7 +722,7 @@
         <w:drawing>
           <wp:inline xmlns:a="http://schemas.openxmlformats.org/drawingml/2006/main" xmlns:pic="http://schemas.openxmlformats.org/drawingml/2006/picture">
             <wp:extent cx="5029200" cy="3111838"/>
-            <wp:docPr id="3" name="Picture 3"/>
+            <wp:docPr id="5" name="Picture 5"/>
             <wp:cNvGraphicFramePr>
               <a:graphicFrameLocks noChangeAspect="1"/>
             </wp:cNvGraphicFramePr>
@@ -614,7 +734,7 @@
                     <pic:cNvPicPr/>
                   </pic:nvPicPr>
                   <pic:blipFill>
-                    <a:blip r:embed="rId11"/>
+                    <a:blip r:embed="rId13"/>
                     <a:stretch>
                       <a:fillRect/>
                     </a:stretch>
@@ -711,7 +831,7 @@
         <w:drawing>
           <wp:inline xmlns:a="http://schemas.openxmlformats.org/drawingml/2006/main" xmlns:pic="http://schemas.openxmlformats.org/drawingml/2006/picture">
             <wp:extent cx="5760720" cy="3564469"/>
-            <wp:docPr id="4" name="Picture 4"/>
+            <wp:docPr id="6" name="Picture 6"/>
             <wp:cNvGraphicFramePr>
               <a:graphicFrameLocks noChangeAspect="1"/>
             </wp:cNvGraphicFramePr>
@@ -723,7 +843,7 @@
                     <pic:cNvPicPr/>
                   </pic:nvPicPr>
                   <pic:blipFill>
-                    <a:blip r:embed="rId12"/>
+                    <a:blip r:embed="rId14"/>
                     <a:stretch>
                       <a:fillRect/>
                     </a:stretch>
@@ -811,7 +931,7 @@
         <w:drawing>
           <wp:inline xmlns:a="http://schemas.openxmlformats.org/drawingml/2006/main" xmlns:pic="http://schemas.openxmlformats.org/drawingml/2006/picture">
             <wp:extent cx="5760720" cy="3564469"/>
-            <wp:docPr id="5" name="Picture 5"/>
+            <wp:docPr id="7" name="Picture 7"/>
             <wp:cNvGraphicFramePr>
               <a:graphicFrameLocks noChangeAspect="1"/>
             </wp:cNvGraphicFramePr>
@@ -823,7 +943,7 @@
                     <pic:cNvPicPr/>
                   </pic:nvPicPr>
                   <pic:blipFill>
-                    <a:blip r:embed="rId13"/>
+                    <a:blip r:embed="rId15"/>
                     <a:stretch>
                       <a:fillRect/>
                     </a:stretch>
@@ -1260,7 +1380,7 @@
         <w:drawing>
           <wp:inline xmlns:a="http://schemas.openxmlformats.org/drawingml/2006/main" xmlns:pic="http://schemas.openxmlformats.org/drawingml/2006/picture">
             <wp:extent cx="4389120" cy="3511296"/>
-            <wp:docPr id="6" name="Picture 6"/>
+            <wp:docPr id="8" name="Picture 8"/>
             <wp:cNvGraphicFramePr>
               <a:graphicFrameLocks noChangeAspect="1"/>
             </wp:cNvGraphicFramePr>
@@ -1272,7 +1392,7 @@
                     <pic:cNvPicPr/>
                   </pic:nvPicPr>
                   <pic:blipFill>
-                    <a:blip r:embed="rId14"/>
+                    <a:blip r:embed="rId16"/>
                     <a:stretch>
                       <a:fillRect/>
                     </a:stretch>

</xml_diff>

<commit_message>
Technische Zeichnung (Koordinatensystem + Bemaßung) + Offset-/angle_offset-Erklärung + Kalibrier-Beobachtbarkeit
- docs/make_geometry.py: ingenieurmäßige Zeichnung mit rechtshändigem Koordinatensystem,
  bemaßten Offsets (Maßhilfslinien/Maßpfeile), angle_offset-Bogen, z_angle-Revolve, Schriftfeld
- Konzept-docx: Bedeutung angle_offset (In-Ebenen-Drehung um Y), Begründung der negativen
  Offsets (Datums-/Achsenkonvention), MODEL_Z = reines Höhen-Datum (nicht verzerrend)
- Beobachtbarkeits-Tabelle: welche Offsets per Kalibrierfahrt automatisch ermittelbar sind und wie zuverlässig

Co-Authored-By: Claude Opus 4.8 <noreply@anthropic.com>
</commit_message>
<xml_diff>
--- a/docs/PiLiDAR_Technisches_Konzept.docx
+++ b/docs/PiLiDAR_Technisches_Konzept.docx
@@ -979,7 +979,168 @@
         <w:pStyle w:val="Heading2"/>
       </w:pPr>
       <w:r>
-        <w:t>6.1  Modus A — schrittweise (Original)</w:t>
+        <w:t>6.1  Koordinatensystem &amp; Offsets (technische Zeichnung)</w:t>
+      </w:r>
+    </w:p>
+    <w:p>
+      <w:r>
+        <w:rPr>
+          <w:b w:val="0"/>
+          <w:i w:val="0"/>
+        </w:rPr>
+        <w:t>Es gilt ein rechtshändiges Koordinatensystem (X×Y=Z) mit Ursprung O auf der Drehachse: +Z senkrecht nach oben (= Drehachse, Revolve-Achse), +Y horizontal entlang der LiDAR-Spinachse, +X quer dazu. Maße in mm, Winkel in Grad.</w:t>
+      </w:r>
+    </w:p>
+    <w:p>
+      <w:pPr>
+        <w:jc w:val="center"/>
+      </w:pPr>
+      <w:r>
+        <w:drawing>
+          <wp:inline xmlns:a="http://schemas.openxmlformats.org/drawingml/2006/main" xmlns:pic="http://schemas.openxmlformats.org/drawingml/2006/picture">
+            <wp:extent cx="5760720" cy="3107756"/>
+            <wp:docPr id="8" name="Picture 8"/>
+            <wp:cNvGraphicFramePr>
+              <a:graphicFrameLocks noChangeAspect="1"/>
+            </wp:cNvGraphicFramePr>
+            <a:graphic>
+              <a:graphicData uri="http://schemas.openxmlformats.org/drawingml/2006/picture">
+                <pic:pic>
+                  <pic:nvPicPr>
+                    <pic:cNvPr id="0" name="geometrie_koordinaten.png"/>
+                    <pic:cNvPicPr/>
+                  </pic:nvPicPr>
+                  <pic:blipFill>
+                    <a:blip r:embed="rId16"/>
+                    <a:stretch>
+                      <a:fillRect/>
+                    </a:stretch>
+                  </pic:blipFill>
+                  <pic:spPr>
+                    <a:xfrm>
+                      <a:off x="0" y="0"/>
+                      <a:ext cx="5760720" cy="3107756"/>
+                    </a:xfrm>
+                    <a:prstGeom prst="rect"/>
+                  </pic:spPr>
+                </pic:pic>
+              </a:graphicData>
+            </a:graphic>
+          </wp:inline>
+        </w:drawing>
+      </w:r>
+    </w:p>
+    <w:p>
+      <w:pPr>
+        <w:jc w:val="center"/>
+      </w:pPr>
+      <w:r>
+        <w:rPr>
+          <w:i/>
+          <w:sz w:val="18"/>
+        </w:rPr>
+        <w:t>Koordinatensystem &amp; bemaßte Offsets (Ansicht A: Y-Z-Ebene, Ansicht B: Scan-Ebene X-Z)</w:t>
+      </w:r>
+    </w:p>
+    <w:p>
+      <w:pPr>
+        <w:pStyle w:val="Heading3"/>
+      </w:pPr>
+      <w:r>
+        <w:t>6.1.1  angle_offset — präzise Bedeutung</w:t>
+      </w:r>
+    </w:p>
+    <w:p>
+      <w:r>
+        <w:rPr>
+          <w:b w:val="0"/>
+          <w:i w:val="0"/>
+        </w:rPr>
+        <w:t>angle_offset ist eine Drehung der Messpunkte um die Y-Achse — und Y ist die Normale der vertikalen Scan-Ebene (X-Z). Da die Punkte in dieser Ebene liegen, ist eine Drehung um Y mathematisch IDENTISCH mit einer Verschiebung des Nullwinkels jedes Messpunkts INNERHALB der Ebene:</w:t>
+      </w:r>
+    </w:p>
+    <w:p>
+      <w:r>
+        <w:rPr>
+          <w:b w:val="0"/>
+          <w:i/>
+        </w:rPr>
+        <w:t>Rot_Y(φ)·(r·cos α, 0, r·sin α) = (r·cos(α−φ), 0, r·sin(α−φ))   ⇒   α → α − φ</w:t>
+      </w:r>
+    </w:p>
+    <w:p>
+      <w:r>
+        <w:rPr>
+          <w:b w:val="0"/>
+          <w:i w:val="0"/>
+        </w:rPr>
+        <w:t>Physikalisch korrigiert angle_offset damit die rotatorische Einbau-„Clockung“ des LiDAR um seine eigene Spinachse (Y): den Versatz zwischen dem internen 0°-Bezug des Sensors und der gewünschten Null der Scan-Ebene. Es ist KEINE Verkippung aus der Ebene heraus (das wäre eine Drehung um X oder Z), sondern eine reine In-Ebenen-Winkelkorrektur. Typwert hier: −1,05°.</w:t>
+      </w:r>
+    </w:p>
+    <w:p>
+      <w:pPr>
+        <w:pStyle w:val="Heading3"/>
+      </w:pPr>
+      <w:r>
+        <w:t>6.1.2  Warum die Offsets in Achsrichtung negativ sind</w:t>
+      </w:r>
+    </w:p>
+    <w:p>
+      <w:r>
+        <w:rPr>
+          <w:b w:val="0"/>
+          <w:i w:val="0"/>
+        </w:rPr>
+        <w:t>position_offset = (0, MODEL_Y, MODEL_Z) ist die Lage des LiDAR-Optikzentrums S relativ zum Ursprung O. Das Vorzeichen folgt aus der Wahl des Koordinatensystems, nicht aus einer physikalischen Notwendigkeit:</w:t>
+      </w:r>
+    </w:p>
+    <w:p>
+      <w:pPr>
+        <w:pStyle w:val="ListBullet"/>
+      </w:pPr>
+      <w:r>
+        <w:t>MODEL_Y = −37,5 mm: S liegt auf der −Y-Seite der Drehachse (gegen die gewählte +Y-Richtung der Spinachse).</w:t>
+      </w:r>
+    </w:p>
+    <w:p>
+      <w:pPr>
+        <w:pStyle w:val="ListBullet"/>
+      </w:pPr>
+      <w:r>
+        <w:t>MODEL_Z = −41,9 mm: S liegt baulich UNTERHALB des Datums O (gegen +Z nach oben).</w:t>
+      </w:r>
+    </w:p>
+    <w:p>
+      <w:pPr>
+        <w:pStyle w:val="ListBullet"/>
+      </w:pPr>
+      <w:r>
+        <w:t>Die Translation wird VOR der Z-Revolve angewandt, damit die Drehachse durch den Ursprung verläuft — sie verschiebt die Sensorpunkte auf die Achse.</w:t>
+      </w:r>
+    </w:p>
+    <w:p>
+      <w:pPr>
+        <w:pStyle w:val="ListBullet"/>
+      </w:pPr>
+      <w:r>
+        <w:t>Bei umgekehrter +Y/+Z-Definition oder anderem Datum kehrten sich die Vorzeichen entsprechend um.</w:t>
+      </w:r>
+    </w:p>
+    <w:p>
+      <w:r>
+        <w:rPr>
+          <w:b w:val="0"/>
+          <w:i w:val="0"/>
+        </w:rPr>
+        <w:t>Wichtige Eigenschaft von MODEL_Z: Da die Revolve um Z die Z-Komponente nicht verändert, wirkt ein MODEL_Z-Fehler als reine vertikale Verschiebung der GESAMTEN Wolke — er verzerrt die Geometrie NICHT, sondern legt nur das Höhen-Datum fest. MODEL_Y dagegen ist der Hebelarm der Revolve und beeinflusst die Form unmittelbar.</w:t>
+      </w:r>
+    </w:p>
+    <w:p>
+      <w:pPr>
+        <w:pStyle w:val="Heading2"/>
+      </w:pPr>
+      <w:r>
+        <w:t>6.2  Modus A — schrittweise (Original)</w:t>
       </w:r>
     </w:p>
     <w:p>
@@ -996,7 +1157,7 @@
         <w:pStyle w:val="Heading2"/>
       </w:pPr>
       <w:r>
-        <w:t>6.2  Modus B — kontinuierliche konstante Drehung (neu)</w:t>
+        <w:t>6.3  Modus B — kontinuierliche konstante Drehung (neu)</w:t>
       </w:r>
     </w:p>
     <w:p>
@@ -1092,6 +1253,309 @@
       </w:pPr>
       <w:r>
         <w:t>Ausrichtung: geführter manueller Wand-Check zur Verifikation der vertikalen Scan-Ebene.</w:t>
+      </w:r>
+    </w:p>
+    <w:p>
+      <w:pPr>
+        <w:pStyle w:val="Heading2"/>
+      </w:pPr>
+      <w:r>
+        <w:t>7.1  Automatische Ermittelbarkeit &amp; Zuverlässigkeit</w:t>
+      </w:r>
+    </w:p>
+    <w:p>
+      <w:r>
+        <w:rPr>
+          <w:b w:val="0"/>
+          <w:i w:val="0"/>
+        </w:rPr>
+        <w:t>Können ALLE Offsets automatisch durch eine Kalibrierfahrt bestimmt werden? — Größtenteils ja, mit einer wichtigen Ausnahme (MODEL_Z). Entscheidend ist die Beobachtbarkeit aus den Eigendaten:</w:t>
+      </w:r>
+    </w:p>
+    <w:tbl>
+      <w:tblPr>
+        <w:tblStyle w:val="LightGrid-Accent1"/>
+        <w:tblW w:type="auto" w:w="0"/>
+        <w:tblLook w:firstColumn="1" w:firstRow="1" w:lastColumn="0" w:lastRow="0" w:noHBand="0" w:noVBand="1" w:val="04A0"/>
+      </w:tblPr>
+      <w:tblGrid>
+        <w:gridCol w:w="2160"/>
+        <w:gridCol w:w="2160"/>
+        <w:gridCol w:w="2160"/>
+        <w:gridCol w:w="2160"/>
+      </w:tblGrid>
+      <w:tr>
+        <w:tc>
+          <w:tcPr>
+            <w:tcW w:type="dxa" w:w="2160"/>
+          </w:tcPr>
+          <w:p>
+            <w:r>
+              <w:rPr>
+                <w:b/>
+              </w:rPr>
+              <w:t>Parameter</w:t>
+            </w:r>
+          </w:p>
+        </w:tc>
+        <w:tc>
+          <w:tcPr>
+            <w:tcW w:type="dxa" w:w="2160"/>
+          </w:tcPr>
+          <w:p>
+            <w:r>
+              <w:rPr>
+                <w:b/>
+              </w:rPr>
+              <w:t>Auto-Kalibrierung</w:t>
+            </w:r>
+          </w:p>
+        </w:tc>
+        <w:tc>
+          <w:tcPr>
+            <w:tcW w:type="dxa" w:w="2160"/>
+          </w:tcPr>
+          <w:p>
+            <w:r>
+              <w:rPr>
+                <w:b/>
+              </w:rPr>
+              <w:t>Beobachtbarkeit / Methode</w:t>
+            </w:r>
+          </w:p>
+        </w:tc>
+        <w:tc>
+          <w:tcPr>
+            <w:tcW w:type="dxa" w:w="2160"/>
+          </w:tcPr>
+          <w:p>
+            <w:r>
+              <w:rPr>
+                <w:b/>
+              </w:rPr>
+              <w:t>Zuverlässigkeit</w:t>
+            </w:r>
+          </w:p>
+        </w:tc>
+      </w:tr>
+      <w:tr>
+        <w:tc>
+          <w:tcPr>
+            <w:tcW w:type="dxa" w:w="2160"/>
+          </w:tcPr>
+          <w:p>
+            <w:r>
+              <w:t>gear_ratio (Schritte/Grad)</w:t>
+            </w:r>
+          </w:p>
+        </w:tc>
+        <w:tc>
+          <w:tcPr>
+            <w:tcW w:type="dxa" w:w="2160"/>
+          </w:tcPr>
+          <w:p>
+            <w:r>
+              <w:t>ja</w:t>
+            </w:r>
+          </w:p>
+        </w:tc>
+        <w:tc>
+          <w:tcPr>
+            <w:tcW w:type="dxa" w:w="2160"/>
+          </w:tcPr>
+          <w:p>
+            <w:r>
+              <w:t>360°-Lauf, Kreuzkorrelation der Profile</w:t>
+            </w:r>
+          </w:p>
+        </w:tc>
+        <w:tc>
+          <w:tcPr>
+            <w:tcW w:type="dxa" w:w="2160"/>
+          </w:tcPr>
+          <w:p>
+            <w:r>
+              <w:t>hoch in strukturierten Räumen; schwach bei symmetrischen/leeren Szenen</w:t>
+            </w:r>
+          </w:p>
+        </w:tc>
+      </w:tr>
+      <w:tr>
+        <w:tc>
+          <w:tcPr>
+            <w:tcW w:type="dxa" w:w="2160"/>
+          </w:tcPr>
+          <w:p>
+            <w:r>
+              <w:t>angle_offset (Clocking)</w:t>
+            </w:r>
+          </w:p>
+        </w:tc>
+        <w:tc>
+          <w:tcPr>
+            <w:tcW w:type="dxa" w:w="2160"/>
+          </w:tcPr>
+          <w:p>
+            <w:r>
+              <w:t>ja</w:t>
+            </w:r>
+          </w:p>
+        </w:tc>
+        <w:tc>
+          <w:tcPr>
+            <w:tcW w:type="dxa" w:w="2160"/>
+          </w:tcPr>
+          <w:p>
+            <w:r>
+              <w:t>Selbstkonsistenz φ/φ+180° (rotatorischer Versatz)</w:t>
+            </w:r>
+          </w:p>
+        </w:tc>
+        <w:tc>
+          <w:tcPr>
+            <w:tcW w:type="dxa" w:w="2160"/>
+          </w:tcPr>
+          <w:p>
+            <w:r>
+              <w:t>hoch; Nahbereichsstruktur trennt es von MODEL_Y</w:t>
+            </w:r>
+          </w:p>
+        </w:tc>
+      </w:tr>
+      <w:tr>
+        <w:tc>
+          <w:tcPr>
+            <w:tcW w:type="dxa" w:w="2160"/>
+          </w:tcPr>
+          <w:p>
+            <w:r>
+              <w:t>MODEL_Y (Hebelarm)</w:t>
+            </w:r>
+          </w:p>
+        </w:tc>
+        <w:tc>
+          <w:tcPr>
+            <w:tcW w:type="dxa" w:w="2160"/>
+          </w:tcPr>
+          <w:p>
+            <w:r>
+              <w:t>ja</w:t>
+            </w:r>
+          </w:p>
+        </w:tc>
+        <w:tc>
+          <w:tcPr>
+            <w:tcW w:type="dxa" w:w="2160"/>
+          </w:tcPr>
+          <w:p>
+            <w:r>
+              <w:t>Parallaxe in der Überlappung skaliert mit MODEL_Y</w:t>
+            </w:r>
+          </w:p>
+        </w:tc>
+        <w:tc>
+          <w:tcPr>
+            <w:tcW w:type="dxa" w:w="2160"/>
+          </w:tcPr>
+          <w:p>
+            <w:r>
+              <w:t>mittel–hoch; braucht variierte Distanzen</w:t>
+            </w:r>
+          </w:p>
+        </w:tc>
+      </w:tr>
+      <w:tr>
+        <w:tc>
+          <w:tcPr>
+            <w:tcW w:type="dxa" w:w="2160"/>
+          </w:tcPr>
+          <w:p>
+            <w:r>
+              <w:t>MODEL_Z (Höhen-Datum)</w:t>
+            </w:r>
+          </w:p>
+        </w:tc>
+        <w:tc>
+          <w:tcPr>
+            <w:tcW w:type="dxa" w:w="2160"/>
+          </w:tcPr>
+          <w:p>
+            <w:r>
+              <w:t>nein</w:t>
+            </w:r>
+          </w:p>
+        </w:tc>
+        <w:tc>
+          <w:tcPr>
+            <w:tcW w:type="dxa" w:w="2160"/>
+          </w:tcPr>
+          <w:p>
+            <w:r>
+              <w:t>nicht beobachtbar — nur globaler vertikaler Versatz, keine Verzerrung</w:t>
+            </w:r>
+          </w:p>
+        </w:tc>
+        <w:tc>
+          <w:tcPr>
+            <w:tcW w:type="dxa" w:w="2160"/>
+          </w:tcPr>
+          <w:p>
+            <w:r>
+              <w:t>nicht nötig; aus Mechanik/externer Referenz (z.B. Boden) setzen</w:t>
+            </w:r>
+          </w:p>
+        </w:tc>
+      </w:tr>
+      <w:tr>
+        <w:tc>
+          <w:tcPr>
+            <w:tcW w:type="dxa" w:w="2160"/>
+          </w:tcPr>
+          <w:p>
+            <w:r>
+              <w:t>overlap Δ (&gt;180°)</w:t>
+            </w:r>
+          </w:p>
+        </w:tc>
+        <w:tc>
+          <w:tcPr>
+            <w:tcW w:type="dxa" w:w="2160"/>
+          </w:tcPr>
+          <w:p>
+            <w:r>
+              <w:t>ja</w:t>
+            </w:r>
+          </w:p>
+        </w:tc>
+        <w:tc>
+          <w:tcPr>
+            <w:tcW w:type="dxa" w:w="2160"/>
+          </w:tcPr>
+          <w:p>
+            <w:r>
+              <w:t>wird in der Offset-Optimierung mitgeschätzt</w:t>
+            </w:r>
+          </w:p>
+        </w:tc>
+        <w:tc>
+          <w:tcPr>
+            <w:tcW w:type="dxa" w:w="2160"/>
+          </w:tcPr>
+          <w:p>
+            <w:r>
+              <w:t>gut</w:t>
+            </w:r>
+          </w:p>
+        </w:tc>
+      </w:tr>
+    </w:tbl>
+    <w:p>
+      <w:r>
+        <w:rPr>
+          <w:b w:val="0"/>
+          <w:i w:val="0"/>
+        </w:rPr>
+        <w:t>Voraussetzungen für verlässliche Ergebnisse: Szene mit Struktur (keine leeren/symmetrischen Räume), variierte Distanzen (Nah- und Fernbereich), ausreichend Überlappungspunkte, KEIN Schrittverlust während des Kalibrierscans (sonst wird die Annahme konstanter ω verletzt). Der Optimierer wird mit den mechanischen Nennwerten gestartet, um lokale Minima zu vermeiden. angle_offset und MODEL_Y können im Fernbereich leicht korrelieren (eine kleine Clockung sieht aus wie ein kleiner seitlicher Versatz) — Nahbereichsstruktur löst diese Mehrdeutigkeit. Das Loop-Closure-Residuum (AP/QA) dient zugleich als Gütemaß: sinkt es nach der Kalibrierung deutlich, sind die Parameter konsistent.</w:t>
       </w:r>
     </w:p>
     <w:p>
@@ -1380,7 +1844,7 @@
         <w:drawing>
           <wp:inline xmlns:a="http://schemas.openxmlformats.org/drawingml/2006/main" xmlns:pic="http://schemas.openxmlformats.org/drawingml/2006/picture">
             <wp:extent cx="4389120" cy="3511296"/>
-            <wp:docPr id="8" name="Picture 8"/>
+            <wp:docPr id="9" name="Picture 9"/>
             <wp:cNvGraphicFramePr>
               <a:graphicFrameLocks noChangeAspect="1"/>
             </wp:cNvGraphicFramePr>
@@ -1392,7 +1856,7 @@
                     <pic:cNvPicPr/>
                   </pic:nvPicPr>
                   <pic:blipFill>
-                    <a:blip r:embed="rId16"/>
+                    <a:blip r:embed="rId17"/>
                     <a:stretch>
                       <a:fillRect/>
                     </a:stretch>

</xml_diff>

<commit_message>
Montage- und Scan-Vorgang-Skizze auf technischen Zeichenstil umgestellt
- lidar_montage: Baugruppen-Schnitt (Y-Z) mit Koordinatentriade, Drehachsen-
  Mittellinie, bemaßtem center_height/axis_offset, Spinachse, Schriftfeld
- scan_vorgang: Messgeometrie (Scan-Ebene) + Rechenketten-Notizblock, Schriftfeld
- Konzept-docx mit den neuen technischen Zeichnungen aktualisiert

Co-Authored-By: Claude Opus 4.8 <noreply@anthropic.com>
</commit_message>
<xml_diff>
--- a/docs/PiLiDAR_Technisches_Konzept.docx
+++ b/docs/PiLiDAR_Technisches_Konzept.docx
@@ -830,7 +830,7 @@
       <w:r>
         <w:drawing>
           <wp:inline xmlns:a="http://schemas.openxmlformats.org/drawingml/2006/main" xmlns:pic="http://schemas.openxmlformats.org/drawingml/2006/picture">
-            <wp:extent cx="5760720" cy="3564469"/>
+            <wp:extent cx="5760720" cy="3578629"/>
             <wp:docPr id="6" name="Picture 6"/>
             <wp:cNvGraphicFramePr>
               <a:graphicFrameLocks noChangeAspect="1"/>
@@ -851,7 +851,7 @@
                   <pic:spPr>
                     <a:xfrm>
                       <a:off x="0" y="0"/>
-                      <a:ext cx="5760720" cy="3564469"/>
+                      <a:ext cx="5760720" cy="3578629"/>
                     </a:xfrm>
                     <a:prstGeom prst="rect"/>
                   </pic:spPr>
@@ -930,7 +930,7 @@
       <w:r>
         <w:drawing>
           <wp:inline xmlns:a="http://schemas.openxmlformats.org/drawingml/2006/main" xmlns:pic="http://schemas.openxmlformats.org/drawingml/2006/picture">
-            <wp:extent cx="5760720" cy="3564469"/>
+            <wp:extent cx="5760720" cy="3107756"/>
             <wp:docPr id="7" name="Picture 7"/>
             <wp:cNvGraphicFramePr>
               <a:graphicFrameLocks noChangeAspect="1"/>
@@ -951,7 +951,7 @@
                   <pic:spPr>
                     <a:xfrm>
                       <a:off x="0" y="0"/>
-                      <a:ext cx="5760720" cy="3564469"/>
+                      <a:ext cx="5760720" cy="3107756"/>
                     </a:xfrm>
                     <a:prstGeom prst="rect"/>
                   </pic:spPr>

</xml_diff>